<commit_message>
updated manual (after JA's feedback)
</commit_message>
<xml_diff>
--- a/apps/EMS/manual.docx
+++ b/apps/EMS/manual.docx
@@ -28,7 +28,37 @@
     </w:p>
     <w:p>
       <w:r>
-        <w:t>We are introducing a set of EMS (Energy Management System) applications designed to demonstrate how KNX IoT technology can manage renewable energy and charging infrastructure in a smart home or building. The apps showcase interoperability between solar panels, energy management logic, and electric vehicle chargers.</w:t>
+        <w:t xml:space="preserve">We are pleased to introduce a suite of </w:t>
+      </w:r>
+      <w:r>
+        <w:rPr>
+          <w:b/>
+          <w:bCs/>
+        </w:rPr>
+        <w:t>Energy Management System (EMS)</w:t>
+      </w:r>
+      <w:r>
+        <w:t xml:space="preserve"> demonstration applications that illustrate the capabilities of </w:t>
+      </w:r>
+      <w:r>
+        <w:rPr>
+          <w:b/>
+          <w:bCs/>
+        </w:rPr>
+        <w:t>KNX IoT technology</w:t>
+      </w:r>
+      <w:r>
+        <w:t xml:space="preserve"> in managing renewable energy and charging infrastructure within smart homes and buildings. These applications highlight seamless </w:t>
+      </w:r>
+      <w:r>
+        <w:rPr>
+          <w:b/>
+          <w:bCs/>
+        </w:rPr>
+        <w:t>interoperability</w:t>
+      </w:r>
+      <w:r>
+        <w:t> between photovoltaic systems, energy management logic, and electric vehicle charging solutions, showcasing how KNX IoT enables efficient, integrated, and sustainable energy management.</w:t>
       </w:r>
     </w:p>
     <w:p>

</xml_diff>